<commit_message>
Content corruption fix + TOC page numbers, running headers, and back-of-book index
- Fixed 8 corrupted spots in Tobit, Judith, and Wisdom of Solomon left by an
  earlier trim script's position-drift bug; restored lost entry headers,
  references, and reconciliation text
- Fixed a latent pandoc yaml_metadata_block bug that could break the whole
  concatenated-document build (affects assemble.py, render_html.py, and all
  CI pandoc calls)
- Added a native Word TOC field with real page numbers (PAGEREF per target)
- Added running headers (section + book) via STYLEREF
- Added a compiled back-of-book Index (XE/INDEX fields) covering every
  numbered RCP claim and every dashed M&TD variant entry
- Added build/update_fields_and_export.py (UNO-based field resolution,
  since headless LibreOffice doesn't auto-update TOC/index fields) and
  wired it into build-docs.yml in place of the old bare soffice calls
</commit_message>
<xml_diff>
--- a/build/custom-reference.docx
+++ b/build/custom-reference.docx
@@ -576,6 +576,105 @@
 
 <file path=word/header1.xml><?xml version="1.0" encoding="utf-8"?>
 <w:hdr xmlns:m="http://schemas.openxmlformats.org/officeDocument/2006/math" xmlns:mc="http://schemas.openxmlformats.org/markup-compatibility/2006" xmlns:mo="http://schemas.microsoft.com/office/mac/office/2008/main" xmlns:mv="urn:schemas-microsoft-com:mac:vml" xmlns:o="urn:schemas-microsoft-com:office:office" xmlns:r="http://schemas.openxmlformats.org/officeDocument/2006/relationships" xmlns:v="urn:schemas-microsoft-com:vml" xmlns:w10="urn:schemas-microsoft-com:office:word" xmlns:w14="http://schemas.microsoft.com/office/word/2010/wordml" xmlns:w="http://schemas.openxmlformats.org/wordprocessingml/2006/main" xmlns:wne="http://schemas.microsoft.com/office/word/2006/wordml" xmlns:wp14="http://schemas.microsoft.com/office/word/2010/wordprocessingDrawing" xmlns:wp="http://schemas.openxmlformats.org/drawingml/2006/wordprocessingDrawing" xmlns:wpc="http://schemas.microsoft.com/office/word/2010/wordprocessingCanvas" xmlns:wpg="http://schemas.microsoft.com/office/word/2010/wordprocessingGroup" xmlns:wpi="http://schemas.microsoft.com/office/word/2010/wordprocessingInk" xmlns:wps="http://schemas.microsoft.com/office/word/2010/wordprocessingShape" mc:Ignorable="w14 wp14">
+  <w:p>
+    <w:pPr>
+      <w:pStyle w:val="Header"/>
+      <w:jc w:val="right"/>
+      <w:rPr>
+        <w:sz w:val="16"/>
+        <w:szCs w:val="16"/>
+        <w:i/>
+      </w:rPr>
+    </w:pPr>
+    <w:r>
+      <w:rPr>
+        <w:sz w:val="16"/>
+        <w:szCs w:val="16"/>
+        <w:i/>
+      </w:rPr>
+      <w:fldChar w:fldCharType="begin"/>
+    </w:r>
+    <w:r>
+      <w:rPr>
+        <w:sz w:val="16"/>
+        <w:szCs w:val="16"/>
+        <w:i/>
+      </w:rPr>
+      <w:instrText xml:space="preserve"> STYLEREF 1 \* MERGEFORMAT </w:instrText>
+    </w:r>
+    <w:r>
+      <w:rPr>
+        <w:sz w:val="16"/>
+        <w:szCs w:val="16"/>
+        <w:i/>
+      </w:rPr>
+      <w:fldChar w:fldCharType="separate"/>
+    </w:r>
+    <w:r>
+      <w:rPr>
+        <w:sz w:val="16"/>
+        <w:szCs w:val="16"/>
+        <w:i/>
+      </w:rPr>
+      <w:t>A Bible Study Primer</w:t>
+    </w:r>
+    <w:r>
+      <w:rPr>
+        <w:sz w:val="16"/>
+        <w:szCs w:val="16"/>
+        <w:i/>
+      </w:rPr>
+      <w:fldChar w:fldCharType="end"/>
+    </w:r>
+    <w:r>
+      <w:rPr>
+        <w:sz w:val="16"/>
+        <w:szCs w:val="16"/>
+        <w:i/>
+      </w:rPr>
+      <w:t xml:space="preserve"> — </w:t>
+    </w:r>
+    <w:r>
+      <w:rPr>
+        <w:sz w:val="16"/>
+        <w:szCs w:val="16"/>
+        <w:i/>
+      </w:rPr>
+      <w:fldChar w:fldCharType="begin"/>
+    </w:r>
+    <w:r>
+      <w:rPr>
+        <w:sz w:val="16"/>
+        <w:szCs w:val="16"/>
+        <w:i/>
+      </w:rPr>
+      <w:instrText xml:space="preserve"> STYLEREF 4 \* MERGEFORMAT </w:instrText>
+    </w:r>
+    <w:r>
+      <w:rPr>
+        <w:sz w:val="16"/>
+        <w:szCs w:val="16"/>
+        <w:i/>
+      </w:rPr>
+      <w:fldChar w:fldCharType="separate"/>
+    </w:r>
+    <w:r>
+      <w:rPr>
+        <w:sz w:val="16"/>
+        <w:szCs w:val="16"/>
+        <w:i/>
+      </w:rPr>
+      <w:t>Genesis</w:t>
+    </w:r>
+    <w:r>
+      <w:rPr>
+        <w:sz w:val="16"/>
+        <w:szCs w:val="16"/>
+        <w:i/>
+      </w:rPr>
+      <w:fldChar w:fldCharType="end"/>
+    </w:r>
+  </w:p>
   <w:p>
     <w:pPr>
       <w:pStyle w:val="Header"/>
@@ -617,6 +716,105 @@
 
 <file path=word/header2.xml><?xml version="1.0" encoding="utf-8"?>
 <w:hdr xmlns:m="http://schemas.openxmlformats.org/officeDocument/2006/math" xmlns:mc="http://schemas.openxmlformats.org/markup-compatibility/2006" xmlns:mo="http://schemas.microsoft.com/office/mac/office/2008/main" xmlns:mv="urn:schemas-microsoft-com:mac:vml" xmlns:o="urn:schemas-microsoft-com:office:office" xmlns:r="http://schemas.openxmlformats.org/officeDocument/2006/relationships" xmlns:v="urn:schemas-microsoft-com:vml" xmlns:w10="urn:schemas-microsoft-com:office:word" xmlns:w14="http://schemas.microsoft.com/office/word/2010/wordml" xmlns:w="http://schemas.openxmlformats.org/wordprocessingml/2006/main" xmlns:wne="http://schemas.microsoft.com/office/word/2006/wordml" xmlns:wp14="http://schemas.microsoft.com/office/word/2010/wordprocessingDrawing" xmlns:wp="http://schemas.openxmlformats.org/drawingml/2006/wordprocessingDrawing" xmlns:wpc="http://schemas.microsoft.com/office/word/2010/wordprocessingCanvas" xmlns:wpg="http://schemas.microsoft.com/office/word/2010/wordprocessingGroup" xmlns:wpi="http://schemas.microsoft.com/office/word/2010/wordprocessingInk" xmlns:wps="http://schemas.microsoft.com/office/word/2010/wordprocessingShape" mc:Ignorable="w14 wp14">
+  <w:p>
+    <w:pPr>
+      <w:pStyle w:val="Header"/>
+      <w:jc w:val="left"/>
+      <w:rPr>
+        <w:sz w:val="16"/>
+        <w:szCs w:val="16"/>
+        <w:i/>
+      </w:rPr>
+    </w:pPr>
+    <w:r>
+      <w:rPr>
+        <w:sz w:val="16"/>
+        <w:szCs w:val="16"/>
+        <w:i/>
+      </w:rPr>
+      <w:fldChar w:fldCharType="begin"/>
+    </w:r>
+    <w:r>
+      <w:rPr>
+        <w:sz w:val="16"/>
+        <w:szCs w:val="16"/>
+        <w:i/>
+      </w:rPr>
+      <w:instrText xml:space="preserve"> STYLEREF 1 \* MERGEFORMAT </w:instrText>
+    </w:r>
+    <w:r>
+      <w:rPr>
+        <w:sz w:val="16"/>
+        <w:szCs w:val="16"/>
+        <w:i/>
+      </w:rPr>
+      <w:fldChar w:fldCharType="separate"/>
+    </w:r>
+    <w:r>
+      <w:rPr>
+        <w:sz w:val="16"/>
+        <w:szCs w:val="16"/>
+        <w:i/>
+      </w:rPr>
+      <w:t>A Bible Study Primer</w:t>
+    </w:r>
+    <w:r>
+      <w:rPr>
+        <w:sz w:val="16"/>
+        <w:szCs w:val="16"/>
+        <w:i/>
+      </w:rPr>
+      <w:fldChar w:fldCharType="end"/>
+    </w:r>
+    <w:r>
+      <w:rPr>
+        <w:sz w:val="16"/>
+        <w:szCs w:val="16"/>
+        <w:i/>
+      </w:rPr>
+      <w:t xml:space="preserve"> — </w:t>
+    </w:r>
+    <w:r>
+      <w:rPr>
+        <w:sz w:val="16"/>
+        <w:szCs w:val="16"/>
+        <w:i/>
+      </w:rPr>
+      <w:fldChar w:fldCharType="begin"/>
+    </w:r>
+    <w:r>
+      <w:rPr>
+        <w:sz w:val="16"/>
+        <w:szCs w:val="16"/>
+        <w:i/>
+      </w:rPr>
+      <w:instrText xml:space="preserve"> STYLEREF 4 \* MERGEFORMAT </w:instrText>
+    </w:r>
+    <w:r>
+      <w:rPr>
+        <w:sz w:val="16"/>
+        <w:szCs w:val="16"/>
+        <w:i/>
+      </w:rPr>
+      <w:fldChar w:fldCharType="separate"/>
+    </w:r>
+    <w:r>
+      <w:rPr>
+        <w:sz w:val="16"/>
+        <w:szCs w:val="16"/>
+        <w:i/>
+      </w:rPr>
+      <w:t>Genesis</w:t>
+    </w:r>
+    <w:r>
+      <w:rPr>
+        <w:sz w:val="16"/>
+        <w:szCs w:val="16"/>
+        <w:i/>
+      </w:rPr>
+      <w:fldChar w:fldCharType="end"/>
+    </w:r>
+  </w:p>
   <w:p>
     <w:pPr>
       <w:pStyle w:val="Header"/>

</xml_diff>

<commit_message>
References: list the sources cited but not yet read, in a Pending color
</commit_message>
<xml_diff>
--- a/build/custom-reference.docx
+++ b/build/custom-reference.docx
@@ -1526,6 +1526,13 @@
     <w:basedOn w:val="BodyTextChar"/>
     <w:rPr>
       <w:vertAlign w:val="superscript"/>
+    </w:rPr>
+  </w:style>
+  <w:style w:type="character" w:styleId="Pending">
+    <w:name w:val="Pending"/>
+    <w:basedOn w:val="BodyTextChar"/>
+    <w:rPr>
+      <w:color w:val="B45309"/>
     </w:rPr>
   </w:style>
   <w:style w:type="character" w:styleId="Hyperlink">

</xml_diff>